<commit_message>
feat: 防假货三重防线 + 承载页直采(--page) + 跨 Agent MCP 层(mcp_server.py)
</commit_message>
<xml_diff>
--- a/skills/edu-material-harvest/使用教程_高校公开资料采集.docx
+++ b/skills/edu-material-harvest/使用教程_高校公开资料采集.docx
@@ -212,7 +212,7 @@
           <w:b w:val="0"/>
           <w:sz w:val="21"/>
         </w:rPr>
-        <w:t>第 2 步 · 自动发现（只侦察、不下载）：Claude 会摸清该校材料挂在哪些栏目页、附件直链是什么，并对每条候选**实测**可达性与文件类型，产出一份“候选确认表”给你过目。</w:t>
+        <w:t>第 2 步 · 自动发现（只侦察、不下载）：Claude 会摸清该校材料挂在哪些栏目页、附件直链是什么，并对每条候选**实测**可达性与文件类型，产出一份“候选确认表”给你过目。如果目标材料挂在被反爬挡住的子站、自动爬不到，Claude 会改用“先联网搜索定位到挂着材料的那一页，再交给脚本枚举下载”的精准方式——两种方式产出的台账完全一样。</w:t>
       </w:r>
     </w:p>
     <w:p>
@@ -658,6 +658,32 @@
           <w:b/>
           <w:sz w:val="21"/>
         </w:rPr>
+        <w:t>Q：为什么会采到“看起来不像材料”的网页？</w:t>
+      </w:r>
+    </w:p>
+    <w:p>
+      <w:pPr>
+        <w:spacing w:after="160"/>
+      </w:pPr>
+      <w:r>
+        <w:rPr>
+          <w:rFonts w:ascii="微软雅黑" w:hAnsi="微软雅黑" w:eastAsia="微软雅黑"/>
+          <w:b w:val="0"/>
+          <w:sz w:val="21"/>
+        </w:rPr>
+        <w:t>A：极少数情况下，新闻页或招生页正文里出现了“培养方案”“年度报告”等词，可能被误判。工具已内置栏目黑名单与类型复核来尽量剔除；若仍发现不对的条目，告诉 Claude 用“指定承载页”方式重采即可，不会影响已确认的文件。</w:t>
+      </w:r>
+    </w:p>
+    <w:p>
+      <w:pPr>
+        <w:spacing w:after="40"/>
+      </w:pPr>
+      <w:r>
+        <w:rPr>
+          <w:rFonts w:ascii="微软雅黑" w:hAnsi="微软雅黑" w:eastAsia="微软雅黑"/>
+          <w:b/>
+          <w:sz w:val="21"/>
+        </w:rPr>
         <w:t>Q：有些链接提示被拦 / 打不开？</w:t>
       </w:r>
     </w:p>
@@ -698,6 +724,150 @@
           <w:sz w:val="21"/>
         </w:rPr>
         <w:t>A：高校栏目常改版。台账里每条链接都是采集当天实测可达的；用之前建议再核一次。</w:t>
+      </w:r>
+    </w:p>
+    <w:p>
+      <w:pPr>
+        <w:spacing w:after="40"/>
+      </w:pPr>
+      <w:r>
+        <w:rPr>
+          <w:rFonts w:ascii="微软雅黑" w:hAnsi="微软雅黑" w:eastAsia="微软雅黑"/>
+          <w:b/>
+          <w:sz w:val="21"/>
+        </w:rPr>
+        <w:t>Q：能在其它 Agent（Codex、WorkBuddy、千问办公）里用吗？</w:t>
+      </w:r>
+    </w:p>
+    <w:p>
+      <w:pPr>
+        <w:spacing w:after="160"/>
+      </w:pPr>
+      <w:r>
+        <w:rPr>
+          <w:rFonts w:ascii="微软雅黑" w:hAnsi="微软雅黑" w:eastAsia="微软雅黑"/>
+          <w:b w:val="0"/>
+          <w:sz w:val="21"/>
+        </w:rPr>
+        <w:t>A：能。本 skill 带一个零依赖的 MCP 服务，装一次即可让这些客户端用同一套采集能力（见第八节）。不需要你额外安装 Python 包。</w:t>
+      </w:r>
+    </w:p>
+    <w:p>
+      <w:pPr>
+        <w:spacing w:before="200" w:after="120"/>
+      </w:pPr>
+      <w:r>
+        <w:rPr>
+          <w:rFonts w:ascii="微软雅黑" w:hAnsi="微软雅黑" w:eastAsia="微软雅黑"/>
+          <w:b/>
+          <w:color w:val="1F4E79"/>
+          <w:sz w:val="30"/>
+        </w:rPr>
+        <w:t>八、在别的 Agent 里用（Claude Code / Codex / WorkBuddy / 千问办公）</w:t>
+      </w:r>
+    </w:p>
+    <w:p>
+      <w:pPr>
+        <w:spacing w:after="120"/>
+      </w:pPr>
+      <w:r>
+        <w:rPr>
+          <w:rFonts w:ascii="微软雅黑" w:hAnsi="微软雅黑" w:eastAsia="微软雅黑"/>
+          <w:b w:val="0"/>
+          <w:sz w:val="21"/>
+        </w:rPr>
+        <w:t>这套采集能力不止 Claude Code 能用。它带一个**零依赖**的 MCP 服务，把同一套本事交给别的 Agent，**你不需要额外安装任何东西**。</w:t>
+      </w:r>
+    </w:p>
+    <w:p>
+      <w:pPr>
+        <w:spacing w:after="120"/>
+      </w:pPr>
+      <w:r>
+        <w:rPr>
+          <w:rFonts w:ascii="微软雅黑" w:hAnsi="微软雅黑" w:eastAsia="微软雅黑"/>
+          <w:b w:val="0"/>
+          <w:sz w:val="21"/>
+        </w:rPr>
+        <w:t>接入三步（以 Claude Code 为例）：</w:t>
+      </w:r>
+    </w:p>
+    <w:p>
+      <w:pPr>
+        <w:spacing w:after="60"/>
+      </w:pPr>
+      <w:r>
+        <w:rPr>
+          <w:rFonts w:ascii="微软雅黑" w:hAnsi="微软雅黑" w:eastAsia="微软雅黑"/>
+          <w:b w:val="0"/>
+          <w:sz w:val="21"/>
+        </w:rPr>
+        <w:t>1. 在 skill 目录下运行：python scripts/mcp_server.py --print-config，它会显示两行路径（解释器和脚本）。</w:t>
+      </w:r>
+    </w:p>
+    <w:p>
+      <w:pPr>
+        <w:spacing w:after="60"/>
+      </w:pPr>
+      <w:r>
+        <w:rPr>
+          <w:rFonts w:ascii="微软雅黑" w:hAnsi="微软雅黑" w:eastAsia="微软雅黑"/>
+          <w:b w:val="0"/>
+          <w:sz w:val="21"/>
+        </w:rPr>
+        <w:t>2. 接入：python scripts/mcp_server.py --install claude（Codex 用 --install codex，WorkBuddy / 千问办公 用第一条打印出的信息在它们的「连接器 / MCP」里新建）。</w:t>
+      </w:r>
+    </w:p>
+    <w:p>
+      <w:pPr>
+        <w:spacing w:after="60"/>
+      </w:pPr>
+      <w:r>
+        <w:rPr>
+          <w:rFonts w:ascii="微软雅黑" w:hAnsi="微软雅黑" w:eastAsia="微软雅黑"/>
+          <w:b w:val="0"/>
+          <w:sz w:val="21"/>
+        </w:rPr>
+        <w:t>3. 在客户端里就能看到 harvest_school（一键采集）、harvest_pages（指定承载页采集）等工具；说「采集 XX 大学的培养方案」即可。</w:t>
+      </w:r>
+    </w:p>
+    <w:p>
+      <w:pPr>
+        <w:pStyle w:val="ListBullet"/>
+      </w:pPr>
+      <w:r>
+        <w:rPr>
+          <w:rFonts w:ascii="微软雅黑" w:hAnsi="微软雅黑" w:eastAsia="微软雅黑"/>
+          <w:b w:val="0"/>
+          <w:sz w:val="21"/>
+        </w:rPr>
+        <w:t>长任务会自动转后台：工具先返回一个任务号，稍等片刻再取结果，不会把客户端卡到超时。</w:t>
+      </w:r>
+    </w:p>
+    <w:p>
+      <w:pPr>
+        <w:pStyle w:val="ListBullet"/>
+      </w:pPr>
+      <w:r>
+        <w:rPr>
+          <w:rFonts w:ascii="微软雅黑" w:hAnsi="微软雅黑" w:eastAsia="微软雅黑"/>
+          <w:b w:val="0"/>
+          <w:sz w:val="21"/>
+        </w:rPr>
+        <w:t>想让它更省心：把「某校挂着材料的那一页」网址直接告诉它，它就走精准直采，比全站找更稳。</w:t>
+      </w:r>
+    </w:p>
+    <w:p>
+      <w:pPr>
+        <w:spacing w:after="120"/>
+      </w:pPr>
+      <w:r>
+        <w:rPr>
+          <w:rFonts w:ascii="微软雅黑" w:hAnsi="微软雅黑" w:eastAsia="微软雅黑"/>
+          <w:b w:val="0"/>
+          <w:sz w:val="21"/>
+        </w:rPr>
+        <w:t>注意：命令里的 Python 路径要与实际一致；若客户端找不到 Python，就用 --print-config 打印的绝对路径。</w:t>
       </w:r>
     </w:p>
     <w:sectPr>

</xml_diff>

<commit_message>
feat(dsh): 打包 DeepSeek Harness 插件形态 + 接入教程
DSH 里 skill 与 plugin 是两套：skill 靠目录发现（不能用「添加插件」装），
plugin 才走「添加插件」。为让本仓库的 GitHub 地址可在桌面版「添加插件」一键装，
仓库根新增 DSH bundle 三件套：package.json(dsh.bundle.patch) + cordis.patch.yml
+ lib/index.js（把包内 skills/ 注册进宿主技能表，用 import.meta.url 定位，
自带能解析 SKILL.md `|` 块标量 description 的 frontmatter 解析）。

新增 references/11-DeepSeek-Harness接入.md：三方式（① 拷进 ~/.dsh/skills/
当 skill、② GitHub 一键当 plugin、③ 走 MCP）；如实标注 DSH 只桥 MCP 的 tools、
不认 resources/prompts。README、SKILL.md、使用教程 docx 同步补 DSH 一节。
</commit_message>
<xml_diff>
--- a/skills/edu-material-harvest/使用教程_高校公开资料采集.docx
+++ b/skills/edu-material-harvest/使用教程_高校公开资料采集.docx
@@ -762,7 +762,7 @@
           <w:b/>
           <w:sz w:val="21"/>
         </w:rPr>
-        <w:t>Q：能在其它 Agent（Codex、WorkBuddy、千问办公）里用吗？</w:t>
+        <w:t>Q：能在其它 Agent（Codex、WorkBuddy、千问办公、DeepSeek Harness）里用吗？</w:t>
       </w:r>
     </w:p>
     <w:p>
@@ -775,7 +775,33 @@
           <w:b w:val="0"/>
           <w:sz w:val="21"/>
         </w:rPr>
-        <w:t>A：能。本 skill 带一个零依赖的 MCP 服务，装一次即可让这些客户端用同一套采集能力（见第八节）。不需要你额外安装 Python 包。</w:t>
+        <w:t>A：能。本 skill 带一个零依赖的 MCP 服务，装一次即可让这些客户端用同一套采集能力（见第九节）。不需要你额外安装 Python 包。</w:t>
+      </w:r>
+    </w:p>
+    <w:p>
+      <w:pPr>
+        <w:spacing w:after="40"/>
+      </w:pPr>
+      <w:r>
+        <w:rPr>
+          <w:rFonts w:ascii="微软雅黑" w:hAnsi="微软雅黑" w:eastAsia="微软雅黑"/>
+          <w:b/>
+          <w:sz w:val="21"/>
+        </w:rPr>
+        <w:t>Q：DeepSeek Harness 里怎么装？</w:t>
+      </w:r>
+    </w:p>
+    <w:p>
+      <w:pPr>
+        <w:spacing w:after="160"/>
+      </w:pPr>
+      <w:r>
+        <w:rPr>
+          <w:rFonts w:ascii="微软雅黑" w:hAnsi="微软雅黑" w:eastAsia="微软雅黑"/>
+          <w:b w:val="0"/>
+          <w:sz w:val="21"/>
+        </w:rPr>
+        <w:t>A：它和别的客户端不同——在 DSH 里 skill 和插件分开了：最快是把本工具整个文件夹放进 DSH 的技能目录（见第十节）；也可在桌面版“设置 → 插件”里填本仓库地址一键装。</w:t>
       </w:r>
     </w:p>
     <w:p>
@@ -1038,6 +1064,124 @@
           <w:sz w:val="21"/>
         </w:rPr>
         <w:t>注意：命令里的 Python 路径要与实际一致；若客户端找不到 Python，就用 --print-config 打印的绝对路径。</w:t>
+      </w:r>
+    </w:p>
+    <w:p>
+      <w:pPr>
+        <w:spacing w:before="200" w:after="120"/>
+      </w:pPr>
+      <w:r>
+        <w:rPr>
+          <w:rFonts w:ascii="微软雅黑" w:hAnsi="微软雅黑" w:eastAsia="微软雅黑"/>
+          <w:b/>
+          <w:color w:val="1F4E79"/>
+          <w:sz w:val="30"/>
+        </w:rPr>
+        <w:t>十、在 DeepSeek Harness 里用</w:t>
+      </w:r>
+    </w:p>
+    <w:p>
+      <w:pPr>
+        <w:spacing w:after="120"/>
+      </w:pPr>
+      <w:r>
+        <w:rPr>
+          <w:rFonts w:ascii="微软雅黑" w:hAnsi="微软雅黑" w:eastAsia="微软雅黑"/>
+          <w:b w:val="0"/>
+          <w:sz w:val="21"/>
+        </w:rPr>
+        <w:t>DeepSeek Harness（DSH）是 DeepSeek 官方的插件化 Agent，桌面版能从“设置 → 插件”里加东西。它和别的客户端不同：在 DSH 里，skill 和插件是两套——skill 是给模型看的 Markdown 指令，靠“放进技能目录”生效，不能用“添加插件”装；插件才是“添加插件”里那种包。本工具两种都备好了。</w:t>
+      </w:r>
+    </w:p>
+    <w:p>
+      <w:pPr>
+        <w:spacing w:after="120"/>
+      </w:pPr>
+      <w:r>
+        <w:rPr>
+          <w:rFonts w:ascii="微软雅黑" w:hAnsi="微软雅黑" w:eastAsia="微软雅黑"/>
+          <w:b w:val="0"/>
+          <w:sz w:val="21"/>
+        </w:rPr>
+        <w:t>方式一（最快）· 当 skill 用：把本工具的整个文件夹，复制到 DSH 的技能目录：</w:t>
+      </w:r>
+    </w:p>
+    <w:p>
+      <w:pPr>
+        <w:pStyle w:val="ListBullet"/>
+      </w:pPr>
+      <w:r>
+        <w:rPr>
+          <w:rFonts w:ascii="微软雅黑" w:hAnsi="微软雅黑" w:eastAsia="微软雅黑"/>
+          <w:b w:val="0"/>
+          <w:sz w:val="21"/>
+        </w:rPr>
+        <w:t>Windows 用户级：%USERPROFILE%\.dsh\skills\edu-material-harvest</w:t>
+      </w:r>
+    </w:p>
+    <w:p>
+      <w:pPr>
+        <w:pStyle w:val="ListBullet"/>
+      </w:pPr>
+      <w:r>
+        <w:rPr>
+          <w:rFonts w:ascii="微软雅黑" w:hAnsi="微软雅黑" w:eastAsia="微软雅黑"/>
+          <w:b w:val="0"/>
+          <w:sz w:val="21"/>
+        </w:rPr>
+        <w:t>或跨工具的共享目录：%USERPROFILE%\.agents\skills\edu-material-harvest</w:t>
+      </w:r>
+    </w:p>
+    <w:p>
+      <w:pPr>
+        <w:spacing w:after="120"/>
+      </w:pPr>
+      <w:r>
+        <w:rPr>
+          <w:rFonts w:ascii="微软雅黑" w:hAnsi="微软雅黑" w:eastAsia="微软雅黑"/>
+          <w:b w:val="0"/>
+          <w:sz w:val="21"/>
+        </w:rPr>
+        <w:t>放好即生效、不用重启。两条注意：目录名要保持 edu-material-harvest，而且必须直接放在这一层（再往下套一层就不会被发现）。</w:t>
+      </w:r>
+    </w:p>
+    <w:p>
+      <w:pPr>
+        <w:spacing w:after="120"/>
+      </w:pPr>
+      <w:r>
+        <w:rPr>
+          <w:rFonts w:ascii="微软雅黑" w:hAnsi="微软雅黑" w:eastAsia="微软雅黑"/>
+          <w:b w:val="0"/>
+          <w:sz w:val="21"/>
+        </w:rPr>
+        <w:t>方式二 · 当插件用（GitHub 一键）：在桌面版“设置 → 插件 → 添加插件”里，填本仓库的 GitHub 地址安装，装完重启即可。它也能从一个本地文件夹安装。</w:t>
+      </w:r>
+    </w:p>
+    <w:p>
+      <w:pPr>
+        <w:spacing w:after="120"/>
+      </w:pPr>
+      <w:r>
+        <w:rPr>
+          <w:rFonts w:ascii="微软雅黑" w:hAnsi="微软雅黑" w:eastAsia="微软雅黑"/>
+          <w:b w:val="0"/>
+          <w:sz w:val="21"/>
+        </w:rPr>
+        <w:t>方式三 · 走 MCP：把连接信息（那段 JSON）贴进 DSH 的 MCP 配置，工具会以 mcp__ 开头出现。DSH 目前只认工具、不认资源手册——不过“名单口径”这类要点已经写在工具返回里了，不会漏。</w:t>
+      </w:r>
+    </w:p>
+    <w:p>
+      <w:pPr>
+        <w:spacing w:after="120"/>
+      </w:pPr>
+      <w:r>
+        <w:rPr>
+          <w:rFonts w:ascii="微软雅黑" w:hAnsi="微软雅黑" w:eastAsia="微软雅黑"/>
+          <w:b w:val="0"/>
+          <w:sz w:val="21"/>
+        </w:rPr>
+        <w:t>依赖：DSH 自带 Python 3.12（出台账要用的库已含）。若缺 PDF 取名用的库，文件名会退化为通用名，台账照常生成。</w:t>
       </w:r>
     </w:p>
     <w:sectPr>

</xml_diff>